<commit_message>
Fix JASA technical check: add Author Declarations (COI, Data/Code Availability), spell out CDMA in title
Co-Authored-By: Tatsuki Onishi <bougtoir@gmail.com>
</commit_message>
<xml_diff>
--- a/cetacean_analysis/papers/JASA_Cover_Letter.docx
+++ b/cetacean_analysis/papers/JASA_Cover_Letter.docx
@@ -10,7 +10,7 @@
         <w:rPr>
           <w:sz w:val="24"/>
         </w:rPr>
-        <w:t>March 31, 2026</w:t>
+        <w:t>April 01, 2026</w:t>
       </w:r>
     </w:p>
     <w:p/>
@@ -99,7 +99,7 @@
           <w:i/>
           <w:sz w:val="24"/>
         </w:rPr>
-        <w:t>“Quantitative analysis of encoding structures in cetacean acoustic communication: Verification of CDMA-like code division and beat frequency hypotheses”</w:t>
+        <w:t>“Quantitative analysis of encoding structures in cetacean acoustic communication: Verification of code division multiple access-like code division and beat frequency hypotheses”</w:t>
       </w:r>
     </w:p>
     <w:p/>

</xml_diff>

<commit_message>
Fix JASA technical check #2: shorten title to 10 words, embed figures inline at first call-out, add line numbering
Co-Authored-By: Tatsuki Onishi <bougtoir@gmail.com>
</commit_message>
<xml_diff>
--- a/cetacean_analysis/papers/JASA_Cover_Letter.docx
+++ b/cetacean_analysis/papers/JASA_Cover_Letter.docx
@@ -10,7 +10,7 @@
         <w:rPr>
           <w:sz w:val="24"/>
         </w:rPr>
-        <w:t>April 01, 2026</w:t>
+        <w:t>April 07, 2026</w:t>
       </w:r>
     </w:p>
     <w:p/>
@@ -99,7 +99,7 @@
           <w:i/>
           <w:sz w:val="24"/>
         </w:rPr>
-        <w:t>“Quantitative analysis of encoding structures in cetacean acoustic communication: Verification of code division multiple access-like code division and beat frequency hypotheses”</w:t>
+        <w:t>“Encoding structures in cetacean acoustics: Code division and beat frequency analysis”</w:t>
       </w:r>
     </w:p>
     <w:p/>

</xml_diff>